<commit_message>
WIP: proxy voting system (M1-5), legal corpus pipeline, docs
- Proxy voting: auth, delegates, templates, assignments, frontend (M1-5)
- Legal corpus ETL pipeline: scripts/legal/ (fetch, normalize, extract, assemble)
- hoaware/law.py: query API for state HOA law rules
- docs/: design memos, legal ontology, question contract, corpus plan/runbook
- state_hoa_laws.md, TODO.md: reference docs
- tests/test_legal_hardening.py: legal module hardening tests

Co-Authored-By: Claude Sonnet 4.6 <noreply@anthropic.com>
</commit_message>
<xml_diff>
--- a/HOAware Proposal 10032025.docx
+++ b/HOAware Proposal 10032025.docx
@@ -49,6 +49,7 @@
           <w:iCs/>
         </w:rPr>
       </w:pPr>
+      <w:bookmarkStart w:id="0" w:name="OLE_LINK1"/>
       <w:r>
         <w:rPr>
           <w:i/>
@@ -99,6 +100,7 @@
         <w:t>. Be a citizen, not a hostage.</w:t>
       </w:r>
     </w:p>
+    <w:bookmarkEnd w:id="0"/>
     <w:p>
       <w:proofErr w:type="spellStart"/>
       <w:r>
@@ -164,6 +166,9 @@
       <w:r>
         <w:t xml:space="preserve"> </w:t>
       </w:r>
+      <w:r>
+        <w:t>HOA lawyers advise boards to expose the bare minimum information to limit their liability. Since we don’t have liability, we can make viewing the docs more convenient.</w:t>
+      </w:r>
     </w:p>
     <w:p>
       <w:pPr>
@@ -230,13 +235,7 @@
         <w:t>No Innovation</w:t>
       </w:r>
       <w:r>
-        <w:t xml:space="preserve">: </w:t>
-      </w:r>
-      <w:r>
-        <w:t>HOAs are d</w:t>
-      </w:r>
-      <w:r>
-        <w:t>esigned by the builder to keep prices high and stable until all units were sold – years ago! Not designed to adapt as the neighborhood ages. Today’s volunteer board is a caretaker, just trying not to get sued.</w:t>
+        <w:t>: HOAs are designed by the builder to keep prices high and stable until all units were sold – years ago! Not designed to adapt as the neighborhood ages. Today’s volunteer board is a caretaker, just trying not to get sued.</w:t>
       </w:r>
     </w:p>
     <w:p>
@@ -388,10 +387,7 @@
       </w:r>
       <w:proofErr w:type="spellEnd"/>
       <w:r>
-        <w:t xml:space="preserve"> </w:t>
-      </w:r>
-      <w:r>
-        <w:t>removes PII and posts statistics.</w:t>
+        <w:t xml:space="preserve"> removes PII and posts statistics.</w:t>
       </w:r>
     </w:p>
     <w:p>
@@ -406,13 +402,11 @@
         <w:rPr>
           <w:u w:val="single"/>
         </w:rPr>
+        <w:lastRenderedPageBreak/>
         <w:t>Debate</w:t>
       </w:r>
       <w:r>
-        <w:t>: Residents raise proposals and debate them constructively using a</w:t>
-      </w:r>
-      <w:r>
-        <w:t xml:space="preserve">n open-source collaborative decision-making tool like </w:t>
+        <w:t xml:space="preserve">: Residents raise proposals and debate them constructively using an open-source collaborative decision-making tool like </w:t>
       </w:r>
       <w:proofErr w:type="spellStart"/>
       <w:r>
@@ -435,7 +429,6 @@
         <w:rPr>
           <w:u w:val="single"/>
         </w:rPr>
-        <w:lastRenderedPageBreak/>
         <w:t>Evaluation</w:t>
       </w:r>
       <w:r>
@@ -576,15 +569,6 @@
       <w:r>
         <w:t>Digitize PDFs and store text documents</w:t>
       </w:r>
-    </w:p>
-    <w:p>
-      <w:pPr>
-        <w:pStyle w:val="ListParagraph"/>
-        <w:numPr>
-          <w:ilvl w:val="0"/>
-          <w:numId w:val="3"/>
-        </w:numPr>
-      </w:pPr>
     </w:p>
     <w:p>
       <w:pPr>

</xml_diff>